<commit_message>
final manuscript with author information
</commit_message>
<xml_diff>
--- a/manuscript/SOFA2_vs_SOFA1_MIMIC-IV_manuscript.docx
+++ b/manuscript/SOFA2_vs_SOFA1_MIMIC-IV_manuscript.docx
@@ -38,7 +38,7 @@
           <w:i/>
           <w:sz w:val="20"/>
         </w:rPr>
-        <w:t>[to be provided by the authors]</w:t>
+        <w:t>[¹ University of Texas at Dallas, Richardson, Texas, USA</w:t>
       </w:r>
     </w:p>
     <w:p>
@@ -607,7 +607,7 @@
           <w:i w:val="0"/>
           <w:sz w:val="20"/>
         </w:rPr>
-        <w:t>[to be provided by the authors]</w:t>
+        <w:t>² Harvard University, Cambridge, Massachusetts, USA</w:t>
       </w:r>
     </w:p>
     <w:p>
@@ -623,7 +623,7 @@
           <w:i w:val="0"/>
           <w:sz w:val="20"/>
         </w:rPr>
-        <w:t>[to be provided by the authors]</w:t>
+        <w:t>³ Department of Anesthesia and Perioperative Care, University of California, San Francisco, San Francisco, California, USA</w:t>
       </w:r>
     </w:p>
     <w:p>
@@ -639,7 +639,7 @@
           <w:i w:val="0"/>
           <w:sz w:val="20"/>
         </w:rPr>
-        <w:t>[to be provided by the authors]</w:t>
+        <w:t>⁴ Department of Population and Quantitative Health Sciences, UMass Chan Medical School, Worcester, Massachusetts, USA]</w:t>
       </w:r>
     </w:p>
     <w:p>
@@ -17076,6 +17076,67 @@
           </w:p>
         </w:tc>
       </w:tr>
+      <w:tr>
+        <w:trPr>
+          <w:cantSplit w:val="true"/>
+        </w:trPr>
+        <w:tc>
+          <w:tcPr>
+            <w:tcW w:type="dxa" w:w="1152"/>
+          </w:tcPr>
+          <w:p>
+            <w:pPr>
+              <w:spacing w:after="0" w:line="240" w:lineRule="auto"/>
+            </w:pPr>
+            <w:r/>
+            <w:r>
+              <w:rPr>
+                <w:b w:val="0"/>
+                <w:sz w:val="15"/>
+              </w:rPr>
+              <w:t>e9aa24e</w:t>
+            </w:r>
+          </w:p>
+        </w:tc>
+        <w:tc>
+          <w:tcPr>
+            <w:tcW w:type="dxa" w:w="1296"/>
+          </w:tcPr>
+          <w:p>
+            <w:pPr>
+              <w:spacing w:after="0" w:line="240" w:lineRule="auto"/>
+              <w:jc w:val="center"/>
+            </w:pPr>
+            <w:r/>
+            <w:r>
+              <w:rPr>
+                <w:b w:val="0"/>
+                <w:sz w:val="15"/>
+              </w:rPr>
+              <w:t>2026-10-17</w:t>
+            </w:r>
+          </w:p>
+        </w:tc>
+        <w:tc>
+          <w:tcPr>
+            <w:tcW w:type="dxa" w:w="7056"/>
+          </w:tcPr>
+          <w:p>
+            <w:pPr>
+              <w:spacing w:after="0" w:line="240" w:lineRule="auto"/>
+              <w:jc w:val="center"/>
+            </w:pPr>
+            <w:r/>
+            <w:r>
+              <w:rPr>
+                <w:b w:val="0"/>
+                <w:sz w:val="15"/>
+              </w:rPr>
+              <w:t>manuscript build scripts</w:t>
+            </w:r>
+          </w:p>
+        </w:tc>
+      </w:tr>
     </w:tbl>
     <w:p>
       <w:pPr>
@@ -19588,138 +19649,6 @@
                 <w:sz w:val="14"/>
               </w:rPr>
               <w:t>85,228</w:t>
-            </w:r>
-          </w:p>
-        </w:tc>
-      </w:tr>
-      <w:tr>
-        <w:trPr>
-          <w:cantSplit w:val="true"/>
-        </w:trPr>
-        <w:tc>
-          <w:tcPr>
-            <w:tcW w:type="dxa" w:w="4320"/>
-          </w:tcPr>
-          <w:p>
-            <w:pPr>
-              <w:spacing w:after="0" w:line="240" w:lineRule="auto"/>
-            </w:pPr>
-            <w:r/>
-            <w:r>
-              <w:rPr>
-                <w:b w:val="0"/>
-                <w:sz w:val="14"/>
-              </w:rPr>
-              <w:t>extract</w:t>
-            </w:r>
-          </w:p>
-        </w:tc>
-        <w:tc>
-          <w:tcPr>
-            <w:tcW w:type="dxa" w:w="1440"/>
-          </w:tcPr>
-          <w:p>
-            <w:pPr>
-              <w:spacing w:after="0" w:line="240" w:lineRule="auto"/>
-              <w:jc w:val="center"/>
-            </w:pPr>
-            <w:r/>
-            <w:r>
-              <w:rPr>
-                <w:b w:val="0"/>
-                <w:sz w:val="14"/>
-              </w:rPr>
-            </w:r>
-          </w:p>
-        </w:tc>
-        <w:tc>
-          <w:tcPr>
-            <w:tcW w:type="dxa" w:w="864"/>
-          </w:tcPr>
-          <w:p>
-            <w:pPr>
-              <w:spacing w:after="0" w:line="240" w:lineRule="auto"/>
-              <w:jc w:val="center"/>
-            </w:pPr>
-            <w:r/>
-            <w:r>
-              <w:rPr>
-                <w:b w:val="0"/>
-                <w:sz w:val="14"/>
-              </w:rPr>
-            </w:r>
-          </w:p>
-        </w:tc>
-        <w:tc>
-          <w:tcPr>
-            <w:tcW w:type="dxa" w:w="1008"/>
-          </w:tcPr>
-          <w:p>
-            <w:pPr>
-              <w:spacing w:after="0" w:line="240" w:lineRule="auto"/>
-              <w:jc w:val="center"/>
-            </w:pPr>
-            <w:r/>
-            <w:r>
-              <w:rPr>
-                <w:b w:val="0"/>
-                <w:sz w:val="14"/>
-              </w:rPr>
-            </w:r>
-          </w:p>
-        </w:tc>
-        <w:tc>
-          <w:tcPr>
-            <w:tcW w:type="dxa" w:w="1152"/>
-          </w:tcPr>
-          <w:p>
-            <w:pPr>
-              <w:spacing w:after="0" w:line="240" w:lineRule="auto"/>
-              <w:jc w:val="center"/>
-            </w:pPr>
-            <w:r/>
-            <w:r>
-              <w:rPr>
-                <w:b w:val="0"/>
-                <w:sz w:val="14"/>
-              </w:rPr>
-            </w:r>
-          </w:p>
-        </w:tc>
-        <w:tc>
-          <w:tcPr>
-            <w:tcW w:type="dxa" w:w="864"/>
-          </w:tcPr>
-          <w:p>
-            <w:pPr>
-              <w:spacing w:after="0" w:line="240" w:lineRule="auto"/>
-              <w:jc w:val="center"/>
-            </w:pPr>
-            <w:r/>
-            <w:r>
-              <w:rPr>
-                <w:b w:val="0"/>
-                <w:sz w:val="14"/>
-              </w:rPr>
-            </w:r>
-          </w:p>
-        </w:tc>
-        <w:tc>
-          <w:tcPr>
-            <w:tcW w:type="dxa" w:w="864"/>
-          </w:tcPr>
-          <w:p>
-            <w:pPr>
-              <w:spacing w:after="0" w:line="240" w:lineRule="auto"/>
-              <w:jc w:val="center"/>
-            </w:pPr>
-            <w:r/>
-            <w:r>
-              <w:rPr>
-                <w:b w:val="0"/>
-                <w:sz w:val="14"/>
-              </w:rPr>
-              <w:t>0</w:t>
             </w:r>
           </w:p>
         </w:tc>

</xml_diff>